<commit_message>
updated assignment 2 for next year
</commit_message>
<xml_diff>
--- a/assignments/Assignment_2.docx
+++ b/assignments/Assignment_2.docx
@@ -1047,6 +1047,38 @@
     <w:p>
       <w:pPr>
         <w:pStyle w:val="FirstParagraph"/>
+      </w:pPr>
+      <w:r>
+        <w:t xml:space="preserve">If your dataset has a grouping column (sex, site, species, year, treatment),</w:t>
+      </w:r>
+      <w:r>
+        <w:t xml:space="preserve"> </w:t>
+      </w:r>
+      <w:r>
+        <w:t xml:space="preserve">check whether the picture changes when you split by it. A variable that matches</w:t>
+      </w:r>
+      <w:r>
+        <w:t xml:space="preserve"> </w:t>
+      </w:r>
+      <w:r>
+        <w:t xml:space="preserve">nothing in the bestiary is often two or more groups pooled together, each of</w:t>
+      </w:r>
+      <w:r>
+        <w:t xml:space="preserve"> </w:t>
+      </w:r>
+      <w:r>
+        <w:t xml:space="preserve">which is a sensible distribution on its own. Saying that, with a plot, is a</w:t>
+      </w:r>
+      <w:r>
+        <w:t xml:space="preserve"> </w:t>
+      </w:r>
+      <w:r>
+        <w:t xml:space="preserve">better answer than forcing a label onto the pooled data.</w:t>
+      </w:r>
+    </w:p>
+    <w:p>
+      <w:pPr>
+        <w:pStyle w:val="BodyText"/>
       </w:pPr>
       <w:r>
         <w:t xml:space="preserve">If a variable does not look like anything in the bestiary, say so and explain</w:t>

</xml_diff>